<commit_message>
Unifico los estados de la suscripcion, las prioridades y el alcance en todos los documentos
</commit_message>
<xml_diff>
--- a/docs/analisis/INVENTRA_ERS_IEEE_830.docx
+++ b/docs/analisis/INVENTRA_ERS_IEEE_830.docx
@@ -9012,7 +9012,7 @@
           </w:tcPr>
           <w:p>
             <w:r>
-              <w:t>El sistema debe permitir al Administrador de licorera crear cuentas de usuario para su negocio, ingresando nombre completo, correo electrónico, teléfono, rol y contraseña. El sistema valida que el correo no esté repetido dentro de la licorera y que la contraseña cumpla la política de seguridad (mínimo 8 caracteres, con letras y números).</w:t>
+              <w:t>El sistema debe permitir al Administrador de licorera crear cuentas de usuario para su negocio, ingresando nombre completo, correo electrónico, teléfono, rol y contraseña. El sistema valida que el correo no esté repetido en toda la plataforma y que la contraseña cumpla la política de seguridad (mínimo 8 caracteres, con letras y números).</w:t>
             </w:r>
           </w:p>
         </w:tc>
@@ -13012,7 +13012,7 @@
           </w:tcPr>
           <w:p>
             <w:r>
-              <w:t>Alta</w:t>
+              <w:t>Baja</w:t>
             </w:r>
           </w:p>
         </w:tc>
@@ -20901,7 +20901,7 @@
           </w:tcPr>
           <w:p>
             <w:r>
-              <w:t>El sistema debe manejar los estados de la suscripción: activa, en mora y suspendida. Una cuenta en mora muestra avisos de pago; una suspendida permite consultar la información, pero no registrar operaciones nuevas.</w:t>
+              <w:t>El sistema debe manejar los estados de la suscripción: en prueba, activa, en mora, suspendida y cancelada. Una suscripción en prueba da acceso completo hasta su fecha de vencimiento; una activa corresponde al plan contratado y vigente; una cuenta en mora sigue operando y muestra avisos de pago; una suspendida permite consultar la información, pero no registrar operaciones nuevas; y una cancelada corresponde a la baja definitiva del servicio. Al vencer el período de prueba sin contratar un plan, la suscripción pasa a suspendida.</w:t>
             </w:r>
           </w:p>
         </w:tc>
@@ -21458,6 +21458,7 @@
                 <w:b/>
                 <w:bCs/>
               </w:rPr>
+              <w:lastRenderedPageBreak/>
               <w:t>Descripción</w:t>
             </w:r>
           </w:p>
@@ -21492,7 +21493,6 @@
       </w:pPr>
       <w:bookmarkStart w:id="72" w:name="_Toc235640561"/>
       <w:r>
-        <w:lastRenderedPageBreak/>
         <w:t>3.2.8 Módulo AUD — Auditoría y respaldo</w:t>
       </w:r>
       <w:bookmarkEnd w:id="72"/>
@@ -22215,6 +22215,7 @@
                 <w:b/>
                 <w:bCs/>
               </w:rPr>
+              <w:lastRenderedPageBreak/>
               <w:t>Tipo</w:t>
             </w:r>
           </w:p>
@@ -22338,7 +22339,6 @@
                 <w:b/>
                 <w:bCs/>
               </w:rPr>
-              <w:lastRenderedPageBreak/>
               <w:t>Descripción</w:t>
             </w:r>
           </w:p>
@@ -22602,7 +22602,7 @@
           </w:tcPr>
           <w:p>
             <w:r>
-              <w:t>Alta</w:t>
+              <w:t>Media</w:t>
             </w:r>
           </w:p>
         </w:tc>
@@ -22733,6 +22733,7 @@
         <w:spacing w:after="120" w:line="276" w:lineRule="auto"/>
       </w:pPr>
       <w:r>
+        <w:lastRenderedPageBreak/>
         <w:t>El servicio debe estar disponible al menos el 99% del tiempo mensual, considerando que las licoreras operan principalmente en horario nocturno y fines de semana; las ventanas de mantenimiento se programarán en horarios de baja actividad (madrugada de días hábiles).</w:t>
       </w:r>
     </w:p>
@@ -22742,7 +22743,6 @@
       </w:pPr>
       <w:bookmarkStart w:id="82" w:name="_Toc235640571"/>
       <w:r>
-        <w:lastRenderedPageBreak/>
         <w:t>RNF-05 — Mantenibilidad</w:t>
       </w:r>
       <w:bookmarkEnd w:id="82"/>

</xml_diff>

<commit_message>
Retiro del alcance la pasarela de pagos, el descuento y el ticket promedio en documentos, diagramas y prototipo
</commit_message>
<xml_diff>
--- a/docs/analisis/INVENTRA_ERS_IEEE_830.docx
+++ b/docs/analisis/INVENTRA_ERS_IEEE_830.docx
@@ -5918,7 +5918,10 @@
         <w:spacing w:after="120" w:line="276" w:lineRule="auto"/>
       </w:pPr>
       <w:r>
-        <w:t>Definir de manera formal, completa y verificable los requisitos funcionales y no funcionales de INVENTRA. Este documento es la base de los artefactos de diseño (modelo entidad–relación, diagramas UML y prototipo de interfaz), de la construcción del software y de las pruebas. Está dirigido al aprendiz desarrollador, al instructor técnico del SENA que evalúa el proyecto y a cualquier interesado en el alcance del sistema.</w:t>
+        <w:t>Definir de manera formal, completa y verificable los requisitos funcionales y no funcionales de INVENTRA. Este documento es la base de los artefactos de diseño (modelo entidad–relación, diagramas UML y prototipo de interfaz), de la construcción del software y de las pruebas. Está dirigido al aprendiz desarrollador, al instructor técnico del SENA que evalúa el proyecto y a cualquier interesado en el alcance del sistema</w:t>
+      </w:r>
+      <w:r>
+        <w:t>.</w:t>
       </w:r>
     </w:p>
     <w:p>
@@ -9012,7 +9015,7 @@
           </w:tcPr>
           <w:p>
             <w:r>
-              <w:t>El sistema debe permitir al Administrador de licorera crear cuentas de usuario para su negocio, ingresando nombre completo, correo electrónico, teléfono, rol y contraseña. El sistema valida que el correo no esté repetido en toda la plataforma y que la contraseña cumpla la política de seguridad (mínimo 8 caracteres, con letras y números).</w:t>
+              <w:t>El sistema debe permitir al Administrador de licorera crear cuentas de usuario para su negocio, ingresando nombre completo, correo electrónico, rol y contraseña inicial, y de forma opcional el teléfono. El sistema valida que el correo no esté repetido en toda la plataforma y que la contraseña cumpla la política de seguridad (mínimo 8 caracteres, con letras y números).</w:t>
             </w:r>
           </w:p>
         </w:tc>
@@ -9299,7 +9302,11 @@
           </w:tcPr>
           <w:p>
             <w:r>
-              <w:t>El sistema debe permitir a un usuario registrado autenticarse con correo y contraseña. Si las credenciales son correctas, crea una sesión segura y lo dirige al panel según su rol; si son incorrectas, muestra un mensaje genérico de error sin revelar cuál dato falló. Tras 5 intentos fallidos consecutivos, bloquea temporalmente la cuenta.</w:t>
+              <w:t xml:space="preserve">El sistema debe permitir a un usuario registrado autenticarse con correo y contraseña. Si las credenciales son correctas, crea una sesión segura y lo dirige al panel según su rol; si son incorrectas, muestra un mensaje genérico de error sin revelar cuál dato falló. Tras 5 intentos fallidos consecutivos, bloquea temporalmente la cuenta. La pantalla de ingreso ofrece la casilla «Recordarme»: si se marca, la sesión se </w:t>
+            </w:r>
+            <w:r>
+              <w:lastRenderedPageBreak/>
+              <w:t>mantiene abierta en ese dispositivo hasta que el usuario la cierre; si no, termina al cerrar el navegador.</w:t>
             </w:r>
           </w:p>
         </w:tc>
@@ -9364,7 +9371,6 @@
                 <w:b/>
                 <w:bCs/>
               </w:rPr>
-              <w:lastRenderedPageBreak/>
               <w:t>Número de requisito</w:t>
             </w:r>
           </w:p>
@@ -10144,6 +10150,7 @@
                 <w:b/>
                 <w:bCs/>
               </w:rPr>
+              <w:lastRenderedPageBreak/>
               <w:t>Descripción</w:t>
             </w:r>
           </w:p>
@@ -10182,7 +10189,6 @@
           <w:sz w:val="22"/>
           <w:szCs w:val="22"/>
         </w:rPr>
-        <w:lastRenderedPageBreak/>
         <w:t>RF-SEG-06 Editar perfil de usuario</w:t>
       </w:r>
       <w:bookmarkEnd w:id="27"/>
@@ -10736,7 +10742,7 @@
           </w:tcPr>
           <w:p>
             <w:r>
-              <w:t>El sistema debe permitir al Administrador de licorera inactivar (no borrar) las cuentas de empleados retirados. Un usuario inactivo no puede iniciar sesión, pero sus ventas históricas se conservan para los reportes y la auditoría.</w:t>
+              <w:t>El sistema debe permitir al Administrador de licorera inactivar (no borrar) las cuentas de empleados retirados. Un usuario inactivo no puede iniciar sesión, pero sus ventas históricas se conservan para los reportes y la auditoría. También debe permitir reactivar una cuenta inactiva, siempre que el plan contratado admita un usuario activo más.</w:t>
             </w:r>
           </w:p>
         </w:tc>
@@ -10775,6 +10781,7 @@
           <w:sz w:val="22"/>
           <w:szCs w:val="22"/>
         </w:rPr>
+        <w:lastRenderedPageBreak/>
         <w:t>RF-INV-01 Registrar producto</w:t>
       </w:r>
       <w:bookmarkEnd w:id="30"/>
@@ -10942,7 +10949,6 @@
                 <w:b/>
                 <w:bCs/>
               </w:rPr>
-              <w:lastRenderedPageBreak/>
               <w:t>Fuente del requisito</w:t>
             </w:r>
           </w:p>
@@ -11042,7 +11048,7 @@
           </w:tcPr>
           <w:p>
             <w:r>
-              <w:t>El sistema debe permitir registrar cada referencia de producto con: nombre, categoría (aguardiente, ron, cerveza, whisky, vino, otros), presentación (media, botella, litro, garrafa, unidad), código de barras (opcional), precio de compra, precio de venta y stock mínimo de alerta. El precio de venta no puede ser menor que el de compra sin confirmación explícita.</w:t>
+              <w:t>El sistema debe permitir registrar cada referencia de producto con: nombre, categoría (aguardiente, ron, cerveza, whisky, vino, otros), presentación (media, botella, litro, garrafa, unidad), código de barras (opcional), precio de venta y mínimo de existencias para la alerta. El costo no se registra en la referencia: entra con cada lote de mercancía, porque la valoración PEPS exige el costo real de cada entrada y no un costo único por producto.</w:t>
             </w:r>
           </w:p>
         </w:tc>
@@ -11763,7 +11769,6 @@
                 <w:b/>
                 <w:bCs/>
               </w:rPr>
-              <w:lastRenderedPageBreak/>
               <w:t>Tipo</w:t>
             </w:r>
           </w:p>
@@ -12461,6 +12466,7 @@
                 <w:b/>
                 <w:bCs/>
               </w:rPr>
+              <w:lastRenderedPageBreak/>
               <w:t>Descripción</w:t>
             </w:r>
           </w:p>
@@ -12584,7 +12590,6 @@
                 <w:b/>
                 <w:bCs/>
               </w:rPr>
-              <w:lastRenderedPageBreak/>
               <w:t>Nombre</w:t>
             </w:r>
           </w:p>
@@ -13323,6 +13328,7 @@
                 <w:b/>
                 <w:bCs/>
               </w:rPr>
+              <w:lastRenderedPageBreak/>
               <w:t>Descripción</w:t>
             </w:r>
           </w:p>
@@ -13446,7 +13452,6 @@
                 <w:b/>
                 <w:bCs/>
               </w:rPr>
-              <w:lastRenderedPageBreak/>
               <w:t>Nombre</w:t>
             </w:r>
           </w:p>
@@ -13998,6 +14003,7 @@
                 <w:b/>
                 <w:bCs/>
               </w:rPr>
+              <w:lastRenderedPageBreak/>
               <w:t>Número de requisito</w:t>
             </w:r>
           </w:p>
@@ -14203,7 +14209,6 @@
                 <w:b/>
                 <w:bCs/>
               </w:rPr>
-              <w:lastRenderedPageBreak/>
               <w:t>Descripción</w:t>
             </w:r>
           </w:p>
@@ -14221,7 +14226,7 @@
           </w:tcPr>
           <w:p>
             <w:r>
-              <w:t>El sistema debe permitir registrar una venta agregando productos por búsqueda o código de barras, indicando cantidades. Al confirmar, descuenta automáticamente el stock de cada referencia consumiendo los lotes más antiguos (PEPS) y registra en la venta el costo exacto de las unidades despachadas, junto con el precio de venta vigente. No permite vender más unidades de las disponibles sin una confirmación explícita del Administrador.</w:t>
+              <w:t>El sistema debe permitir registrar una venta agregando productos por búsqueda o código de barras, indicando cantidades. Al confirmar, descuenta automáticamente el stock de cada referencia consumiendo los lotes más antiguos (PEPS) y registra en la venta el costo exacto de las unidades despachadas, junto con el precio de venta vigente. No permite registrar una venta que supere las existencias disponibles: el sistema la impide y lo informa con el mensaje «No hay existencias suficientes de este producto».</w:t>
             </w:r>
           </w:p>
         </w:tc>
@@ -14983,7 +14988,6 @@
                 <w:b/>
                 <w:bCs/>
               </w:rPr>
-              <w:lastRenderedPageBreak/>
               <w:t>Fuente del requisito</w:t>
             </w:r>
           </w:p>
@@ -15657,7 +15661,11 @@
           </w:tcPr>
           <w:p>
             <w:r>
-              <w:t>El sistema debe generar el cierre del día: total vendido por medio de pago, número de transacciones, y comparación con el efectivo contado por el usuario, dejando registro de las diferencias.</w:t>
+              <w:t xml:space="preserve">El sistema debe generar el cierre del día: total vendido por medio de pago, número de transacciones, y comparación con el efectivo contado por el usuario, dejando registro de las diferencias. El cierre es diario y por sede, no por turno ni por vendedor: el dinero pertenece a la sede, </w:t>
+            </w:r>
+            <w:r>
+              <w:lastRenderedPageBreak/>
+              <w:t>de modo que varios vendedores registran ventas contra el mismo cierre y este se realiza una vez al día.</w:t>
             </w:r>
           </w:p>
         </w:tc>
@@ -15740,7 +15748,6 @@
                 <w:b/>
                 <w:bCs/>
               </w:rPr>
-              <w:lastRenderedPageBreak/>
               <w:t>Número de requisito</w:t>
             </w:r>
           </w:p>
@@ -16479,6 +16486,7 @@
                 <w:b/>
                 <w:bCs/>
               </w:rPr>
+              <w:lastRenderedPageBreak/>
               <w:t>Prioridad</w:t>
             </w:r>
           </w:p>
@@ -16602,7 +16610,6 @@
                 <w:b/>
                 <w:bCs/>
               </w:rPr>
-              <w:lastRenderedPageBreak/>
               <w:t>Número de requisito</w:t>
             </w:r>
           </w:p>
@@ -17318,6 +17325,7 @@
                 <w:b/>
                 <w:bCs/>
               </w:rPr>
+              <w:lastRenderedPageBreak/>
               <w:t>Fuente del requisito</w:t>
             </w:r>
           </w:p>
@@ -18179,6 +18187,7 @@
                 <w:b/>
                 <w:bCs/>
               </w:rPr>
+              <w:lastRenderedPageBreak/>
               <w:t>Fuente del requisito</w:t>
             </w:r>
           </w:p>
@@ -18299,7 +18308,6 @@
           <w:sz w:val="22"/>
           <w:szCs w:val="22"/>
         </w:rPr>
-        <w:lastRenderedPageBreak/>
         <w:t>RF-REP-05 Reporte de utilidad</w:t>
       </w:r>
       <w:bookmarkEnd w:id="59"/>
@@ -18936,6 +18944,7 @@
                 <w:b/>
                 <w:bCs/>
               </w:rPr>
+              <w:lastRenderedPageBreak/>
               <w:t>Número de requisito</w:t>
             </w:r>
           </w:p>
@@ -19100,7 +19109,6 @@
                 <w:b/>
                 <w:bCs/>
               </w:rPr>
-              <w:lastRenderedPageBreak/>
               <w:t>Prioridad</w:t>
             </w:r>
           </w:p>
@@ -19798,6 +19806,7 @@
                 <w:b/>
                 <w:bCs/>
               </w:rPr>
+              <w:lastRenderedPageBreak/>
               <w:t>Número de requisito</w:t>
             </w:r>
           </w:p>
@@ -20003,7 +20012,6 @@
                 <w:b/>
                 <w:bCs/>
               </w:rPr>
-              <w:lastRenderedPageBreak/>
               <w:t>Descripción</w:t>
             </w:r>
           </w:p>
@@ -20514,6 +20522,7 @@
                 <w:b/>
                 <w:bCs/>
               </w:rPr>
+              <w:lastRenderedPageBreak/>
               <w:t>Fuente del requisito</w:t>
             </w:r>
           </w:p>
@@ -20634,7 +20643,6 @@
           <w:sz w:val="22"/>
           <w:szCs w:val="22"/>
         </w:rPr>
-        <w:lastRenderedPageBreak/>
         <w:t>RF-SUS-03 Controlar estado de la suscripción</w:t>
       </w:r>
       <w:bookmarkEnd w:id="69"/>
@@ -21253,6 +21261,7 @@
                 <w:b/>
                 <w:bCs/>
               </w:rPr>
+              <w:lastRenderedPageBreak/>
               <w:t>Número de requisito</w:t>
             </w:r>
           </w:p>
@@ -21458,7 +21467,6 @@
                 <w:b/>
                 <w:bCs/>
               </w:rPr>
-              <w:lastRenderedPageBreak/>
               <w:t>Descripción</w:t>
             </w:r>
           </w:p>
@@ -22051,6 +22059,7 @@
                 <w:b/>
                 <w:bCs/>
               </w:rPr>
+              <w:lastRenderedPageBreak/>
               <w:t>Descripción</w:t>
             </w:r>
           </w:p>
@@ -22215,7 +22224,6 @@
                 <w:b/>
                 <w:bCs/>
               </w:rPr>
-              <w:lastRenderedPageBreak/>
               <w:t>Tipo</w:t>
             </w:r>
           </w:p>
@@ -22697,7 +22705,11 @@
         <w:spacing w:after="120" w:line="276" w:lineRule="auto"/>
       </w:pPr>
       <w:r>
-        <w:t>Las contraseñas se almacenan cifradas con un algoritmo de hash adaptativo (nunca en texto plano). Toda comunicación viaja por HTTPS. El control de acceso se aplica en el backend según el rol y el tenant del usuario: ningún usuario puede acceder a datos de otra licorera. El tratamiento de datos personales cumple la Ley 1581 de 2012 (aviso de privacidad, finalidad y derechos de los titulares).</w:t>
+        <w:t xml:space="preserve">Las contraseñas se almacenan cifradas con un algoritmo de hash adaptativo (nunca en texto plano). Toda comunicación viaja por HTTPS. El control de acceso se aplica en el backend según el rol y el tenant del usuario: ningún usuario puede acceder a datos de otra licorera. El </w:t>
+      </w:r>
+      <w:r>
+        <w:lastRenderedPageBreak/>
+        <w:t>tratamiento de datos personales cumple la Ley 1581 de 2012 (aviso de privacidad, finalidad y derechos de los titulares).</w:t>
       </w:r>
     </w:p>
     <w:p>
@@ -22733,7 +22745,6 @@
         <w:spacing w:after="120" w:line="276" w:lineRule="auto"/>
       </w:pPr>
       <w:r>
-        <w:lastRenderedPageBreak/>
         <w:t>El servicio debe estar disponible al menos el 99% del tiempo mensual, considerando que las licoreras operan principalmente en horario nocturno y fines de semana; las ventanas de mantenimiento se programarán en horarios de baja actividad (madrugada de días hábiles).</w:t>
       </w:r>
     </w:p>
@@ -22798,7 +22809,7 @@
         <w:spacing w:after="120" w:line="276" w:lineRule="auto"/>
       </w:pPr>
       <w:r>
-        <w:t>El sistema debe poder ser usado por personas sin experiencia técnica después de una capacitación de máximo 3 horas (coherente con el servicio de Implementación y capacitación del modelo de negocio). El vocabulario de la interfaz es el del comercio: «botellas», «surtido», «cierre de caja», evitando términos técnicos.</w:t>
+        <w:t>El sistema debe poder ser usado por personas sin experiencia técnica después de una capacitación de máximo 3 horas (coherente con el servicio de Implementación y capacitación del modelo de negocio). El vocabulario de la interfaz es el del comercio: «botellas», «surtido», «cierre de caja», evitando términos técnicos. La interfaz debe ofrecer modo claro y modo oscuro con sus respectivas paletas y botones de acción, tomando como valor inicial la preferencia del sistema operativo y conservando la elección del usuario en el dispositivo.</w:t>
       </w:r>
     </w:p>
     <w:p>

</xml_diff>

<commit_message>
Fijo el cronograma con las fechas reales de la etapa productiva y unifico la terminologia
</commit_message>
<xml_diff>
--- a/docs/analisis/INVENTRA_ERS_IEEE_830.docx
+++ b/docs/analisis/INVENTRA_ERS_IEEE_830.docx
@@ -5943,7 +5943,10 @@
       </w:r>
       <w:r>
         <w:lastRenderedPageBreak/>
-        <w:t>botella y por referencia, generar alertas de stock bajo y de baja rotación, producir reportes de ventas, rotación y utilidad, emitir facturación electrónica (plan Pro) y administrar sedes y usuarios múltiples (plan Pro). Quedan fuera del alcance de esta versión: la venta en línea al consumidor final, la gestión contable completa y la integración con domicilios.</w:t>
+        <w:t>botella y por referencia, generar alertas de existencias bajas y de baja rotación, producir reportes de ventas, rotación y utilidad, emitir facturación electrónica (plan Pro) y administrar sedes y usuarios múltiples (plan Pro). Quedan fuera del alcance de esta versión: la venta en línea al consumidor final, la gestión contable completa y la integración con domicilios</w:t>
+      </w:r>
+      <w:r>
+        <w:t>.</w:t>
       </w:r>
     </w:p>
     <w:p>
@@ -7345,7 +7348,7 @@
         <w:spacing w:after="80"/>
       </w:pPr>
       <w:r>
-        <w:t>INV — Inventario: catálogo, existencias, entradas por lotes con valoración PEPS, ajustes, alertas de stock bajo y baja rotación.</w:t>
+        <w:t>INV — Inventario: catálogo, existencias, entradas por lotes con valoración PEPS, ajustes, alertas de existencias bajas y baja rotación.</w:t>
       </w:r>
     </w:p>
     <w:p>
@@ -7358,7 +7361,7 @@
         <w:spacing w:after="80"/>
       </w:pPr>
       <w:r>
-        <w:t>VEN — Ventas: punto de venta con descuento automático de stock, medios de pago y cierre de caja.</w:t>
+        <w:t>VEN — Ventas: punto de venta con descuento automático de existencias, medios de pago y cierre de caja.</w:t>
       </w:r>
     </w:p>
     <w:p>
@@ -8653,7 +8656,7 @@
         <w:spacing w:after="120" w:line="276" w:lineRule="auto"/>
       </w:pPr>
       <w:r>
-        <w:t>La interfaz será web responsive, completamente en español, con navegación por módulos y un panel principal que muestre de entrada lo esencial para el tendero: ventas del día, alertas de stock bajo y productos de baja rotación. Los formularios deben validar los datos antes de enviarlos y mostrar mensajes de error claros, en lenguaje cotidiano. Las vistas clave son: página de presentación (landing), autenticación, punto de venta, inventario, reportes y administración.</w:t>
+        <w:t>La interfaz será web responsive, completamente en español, con navegación por módulos y un panel principal que muestre de entrada lo esencial para el tendero: ventas del día, alertas de existencias bajas y productos de baja rotación. Los formularios deben validar los datos antes de enviarlos y mostrar mensajes de error claros, en lenguaje cotidiano. Las vistas clave son: página de presentación (landing), autenticación, punto de venta, inventario, reportes y administración.</w:t>
       </w:r>
     </w:p>
     <w:p>
@@ -10168,7 +10171,7 @@
           </w:tcPr>
           <w:p>
             <w:r>
-              <w:t>El sistema debe restringir cada funcionalidad según el rol del usuario: el Vendedor solo registra ventas y consulta stock; el Administrador de licorera accede a todos los módulos de su negocio; el Administrador INVENTRA gestiona las cuentas de las licoreras (tenants) sin ver la operación interna de cada negocio.</w:t>
+              <w:t>El sistema debe restringir cada funcionalidad según el rol del usuario: el Vendedor solo registra ventas y consulta existencias; el Administrador de licorera accede a todos los módulos de su negocio; el Administrador INVENTRA gestiona las cuentas de las licoreras (tenants) sin ver la operación interna de cada negocio.</w:t>
             </w:r>
           </w:p>
         </w:tc>
@@ -10768,7 +10771,7 @@
         <w:spacing w:after="120" w:line="276" w:lineRule="auto"/>
       </w:pPr>
       <w:r>
-        <w:t>Es el corazón del producto: administra el catálogo de referencias de licor y el control de existencias por botella. Incluye las entradas de mercancía, los ajustes y las dos alertas prometidas en la propuesta de valor: stock bajo y baja rotación. El inventario se valora por lotes con el método PEPS (primeras entradas, primeras salidas), manteniendo el costo de adquisición completamente separado del precio de venta, como lo hacen los sistemas de referencia del mercado (SAP Business One, Dynamics 365 Business Central, Odoo, Siigo).</w:t>
+        <w:t>Es el corazón del producto: administra el catálogo de referencias de licor y el control de existencias por botella. Incluye las entradas de mercancía, los ajustes y las dos alertas prometidas en la propuesta de valor: existencias bajas y baja rotación. El inventario se valora por lotes con el método PEPS (primeras entradas, primeras salidas), manteniendo el costo de adquisición completamente separado del precio de venta, como lo hacen los sistemas de referencia del mercado (SAP Business One, Dynamics 365 Business Central, Odoo, Siigo).</w:t>
       </w:r>
     </w:p>
     <w:p>
@@ -11335,7 +11338,7 @@
           </w:tcPr>
           <w:p>
             <w:r>
-              <w:t>El sistema debe mostrar el catálogo con su existencia actual y permitir búsqueda por nombre, categoría o código de barras, con filtros por estado (activo/inactivo) y por nivel de stock.</w:t>
+              <w:t>El sistema debe mostrar el catálogo con su existencia actual y permitir búsqueda por nombre, categoría o código de barras, con filtros por estado (activo/inactivo) y por nivel de existencias.</w:t>
             </w:r>
           </w:p>
         </w:tc>
@@ -11622,7 +11625,11 @@
           </w:tcPr>
           <w:p>
             <w:r>
-              <w:t>El sistema debe permitir modificar los datos de una referencia (precios, stock mínimo, categoría). Los cambios de precio no alteran las ventas históricas, que conservan el precio vigente al momento de la venta.</w:t>
+              <w:t xml:space="preserve">El sistema debe permitir modificar los datos de una referencia (precios, mínimo de existencias, categoría). Los cambios de precio no alteran </w:t>
+            </w:r>
+            <w:r>
+              <w:lastRenderedPageBreak/>
+              <w:t>las ventas históricas, que conservan el precio vigente al momento de la venta.</w:t>
             </w:r>
           </w:p>
         </w:tc>
@@ -12196,7 +12203,7 @@
           </w:tcPr>
           <w:p>
             <w:r>
-              <w:t>El sistema debe permitir registrar la llegada de mercancía del proveedor como un LOTE de inventario: referencia, cantidad, costo unitario y fecha de ingreso. La entrada suma automáticamente al stock disponible y queda registrada como movimiento en el kardex. Cada lote conserva su propio costo de adquisición, que no se altera por compras posteriores ni por cambios de precio de venta.</w:t>
+              <w:t>El sistema debe permitir registrar la llegada de mercancía del proveedor como un LOTE de inventario: referencia, cantidad, costo unitario y fecha de ingreso. La entrada suma automáticamente a las existencias disponibles y queda registrada como movimiento en el kardex. Cada lote conserva su propio costo de adquisición, que no se altera por compras posteriores ni por cambios de precio de venta.</w:t>
             </w:r>
           </w:p>
         </w:tc>
@@ -12484,7 +12491,7 @@
           </w:tcPr>
           <w:p>
             <w:r>
-              <w:t>El sistema debe permitir ajustes manuales de stock por merma, rotura o conteo físico, exigiendo siempre un motivo. Todo ajuste queda trazado en el kardex con el usuario que lo realizó.</w:t>
+              <w:t>El sistema debe permitir ajustes manuales de existencias por merma, rotura o conteo físico, exigiendo siempre un motivo. Todo ajuste queda trazado en el kardex con el usuario que lo realizó.</w:t>
             </w:r>
           </w:p>
         </w:tc>
@@ -12505,7 +12512,7 @@
           <w:sz w:val="22"/>
           <w:szCs w:val="22"/>
         </w:rPr>
-        <w:t>RF-INV-07 Alertar stock bajo</w:t>
+        <w:t>RF-INV-07 Alertar existencias bajas</w:t>
       </w:r>
       <w:bookmarkEnd w:id="36"/>
     </w:p>
@@ -12607,7 +12614,7 @@
           </w:tcPr>
           <w:p>
             <w:r>
-              <w:t>Alertar stock bajo</w:t>
+              <w:t>Alertar existencias bajas</w:t>
             </w:r>
           </w:p>
         </w:tc>
@@ -12771,7 +12778,7 @@
           </w:tcPr>
           <w:p>
             <w:r>
-              <w:t>El sistema debe generar una alerta visible en el panel principal cuando la existencia de una referencia sea igual o inferior a su stock mínimo configurado, para que el tendero reponga a tiempo y no pierda ventas.</w:t>
+              <w:t>El sistema debe generar una alerta visible en el panel principal cuando la existencia de una referencia sea igual o inferior a su mínimo de existencias configurado, para que el tendero reponga a tiempo y no pierda ventas.</w:t>
             </w:r>
           </w:p>
         </w:tc>
@@ -14226,7 +14233,7 @@
           </w:tcPr>
           <w:p>
             <w:r>
-              <w:t>El sistema debe permitir registrar una venta agregando productos por búsqueda o código de barras, indicando cantidades. Al confirmar, descuenta automáticamente el stock de cada referencia consumiendo los lotes más antiguos (PEPS) y registra en la venta el costo exacto de las unidades despachadas, junto con el precio de venta vigente. No permite registrar una venta que supere las existencias disponibles: el sistema la impide y lo informa con el mensaje «No hay existencias suficientes de este producto».</w:t>
+              <w:t>El sistema debe permitir registrar una venta agregando productos por búsqueda o código de barras, indicando cantidades. Al confirmar, descuenta automáticamente las existencias de cada referencia consumiendo los lotes más antiguos (PEPS) y registra en la venta el costo exacto de las unidades despachadas, junto con el precio de venta vigente. No permite registrar una venta que supere las existencias disponibles: el sistema la impide y lo informa con el mensaje «No hay existencias suficientes de este producto».</w:t>
             </w:r>
           </w:p>
         </w:tc>
@@ -16832,7 +16839,7 @@
           </w:tcPr>
           <w:p>
             <w:r>
-              <w:t>El sistema debe mantener existencias independientes por sede y permitir al Administrador ver el stock consolidado o filtrado por sede.</w:t>
+              <w:t>El sistema debe mantener existencias independientes por sede y permitir al Administrador ver las existencias consolidadas o filtrado por sede.</w:t>
             </w:r>
           </w:p>
         </w:tc>
@@ -17119,7 +17126,7 @@
           </w:tcPr>
           <w:p>
             <w:r>
-              <w:t>El sistema debe permitir registrar traslados de stock entre sedes: descuenta en la sede origen y suma en la destino, dejando el movimiento trazado en el kardex de ambas.</w:t>
+              <w:t>El sistema debe permitir registrar traslados de existencias entre sedes: descuenta en la sede origen y suma en la destino, dejando el movimiento trazado en el kardex de ambas.</w:t>
             </w:r>
           </w:p>
         </w:tc>
@@ -17284,6 +17291,7 @@
                 <w:b/>
                 <w:bCs/>
               </w:rPr>
+              <w:lastRenderedPageBreak/>
               <w:t>Tipo</w:t>
             </w:r>
           </w:p>
@@ -17325,7 +17333,6 @@
                 <w:b/>
                 <w:bCs/>
               </w:rPr>
-              <w:lastRenderedPageBreak/>
               <w:t>Fuente del requisito</w:t>
             </w:r>
           </w:p>
@@ -18146,6 +18153,7 @@
                 <w:b/>
                 <w:bCs/>
               </w:rPr>
+              <w:lastRenderedPageBreak/>
               <w:t>Tipo</w:t>
             </w:r>
           </w:p>
@@ -18187,7 +18195,6 @@
                 <w:b/>
                 <w:bCs/>
               </w:rPr>
-              <w:lastRenderedPageBreak/>
               <w:t>Fuente del requisito</w:t>
             </w:r>
           </w:p>
@@ -18900,6 +18907,7 @@
           <w:sz w:val="22"/>
           <w:szCs w:val="22"/>
         </w:rPr>
+        <w:lastRenderedPageBreak/>
         <w:t>RF-FAC-01 Configurar datos de facturación</w:t>
       </w:r>
       <w:bookmarkEnd w:id="62"/>
@@ -18944,7 +18952,6 @@
                 <w:b/>
                 <w:bCs/>
               </w:rPr>
-              <w:lastRenderedPageBreak/>
               <w:t>Número de requisito</w:t>
             </w:r>
           </w:p>
@@ -20334,7 +20341,7 @@
           </w:tcPr>
           <w:p>
             <w:r>
-              <w:t>El sistema debe permitir crear la cuenta de una licorera nueva con sus datos comerciales, el plan contratado (Básico o Pro) y el usuario administrador inicial, por dos vías: el registro por autoservicio desde la pantalla pública, que inicia un período de prueba gratuito con fecha de vencimiento, y el alta directa por parte del Administrador INVENTRA, con el plan que el negocio haya contratado. En ambos casos la cuenta queda pendiente de verificación hasta que la persona abre el enlace enviado a su correo. Los datos de cada licorera quedan completamente aislados de los de las demás.</w:t>
+              <w:t>El sistema debe permitir crear la cuenta de una licorera nueva con sus datos comerciales, el plan contratado (Básico o Pro) y el usuario administrador inicial, por dos vías: el registro por autoservicio desde la pantalla pública, que inicia un período de prueba gratuito con fecha de vencimiento, y el alta directa por parte del Administrador INVENTRA, con el plan que el negocio haya contratado. En ambos casos la cuenta queda pendiente de verificación hasta que la persona abre el enlace enviado a su correo. Los datos de cada licorera quedan completamente aislados de los de las demás. Mientras el correo no esté verificado, el sistema muestra un aviso permanente y permite pedir un enlace nuevo desde la propia aplicación. El enlace de confirmación vence a los tres días; la cuenta funciona con normalidad entre tanto.</w:t>
             </w:r>
           </w:p>
         </w:tc>
@@ -20399,6 +20406,7 @@
                 <w:b/>
                 <w:bCs/>
               </w:rPr>
+              <w:lastRenderedPageBreak/>
               <w:t>Número de requisito</w:t>
             </w:r>
           </w:p>
@@ -20522,7 +20530,6 @@
                 <w:b/>
                 <w:bCs/>
               </w:rPr>
-              <w:lastRenderedPageBreak/>
               <w:t>Fuente del requisito</w:t>
             </w:r>
           </w:p>
@@ -21196,7 +21203,11 @@
           </w:tcPr>
           <w:p>
             <w:r>
-              <w:t>El sistema debe habilitar o bloquear módulos según el plan: el Básico incluye SEG, INV, VEN y reportes básicos para 1 usuario y 1 sede; el Pro agrega multiusuario, multisede (SED), reportes avanzados (REP) y facturación electrónica (FAC).</w:t>
+              <w:t xml:space="preserve">El sistema debe habilitar o bloquear módulos según el plan: el Básico incluye SEG, INV, VEN y reportes básicos para 1 usuario y 1 sede; el </w:t>
+            </w:r>
+            <w:r>
+              <w:lastRenderedPageBreak/>
+              <w:t>Pro agrega multiusuario, multisede (SED), reportes avanzados (REP) y facturación electrónica (FAC).</w:t>
             </w:r>
           </w:p>
         </w:tc>
@@ -21261,7 +21272,6 @@
                 <w:b/>
                 <w:bCs/>
               </w:rPr>
-              <w:lastRenderedPageBreak/>
               <w:t>Número de requisito</w:t>
             </w:r>
           </w:p>
@@ -21936,6 +21946,7 @@
                 <w:b/>
                 <w:bCs/>
               </w:rPr>
+              <w:lastRenderedPageBreak/>
               <w:t>Tipo</w:t>
             </w:r>
           </w:p>
@@ -22059,7 +22070,6 @@
                 <w:b/>
                 <w:bCs/>
               </w:rPr>
-              <w:lastRenderedPageBreak/>
               <w:t>Descripción</w:t>
             </w:r>
           </w:p>
@@ -22696,6 +22706,7 @@
       </w:pPr>
       <w:bookmarkStart w:id="79" w:name="_Toc235640568"/>
       <w:r>
+        <w:lastRenderedPageBreak/>
         <w:t>RNF-02 — Seguridad</w:t>
       </w:r>
       <w:bookmarkEnd w:id="79"/>
@@ -22705,11 +22716,7 @@
         <w:spacing w:after="120" w:line="276" w:lineRule="auto"/>
       </w:pPr>
       <w:r>
-        <w:t xml:space="preserve">Las contraseñas se almacenan cifradas con un algoritmo de hash adaptativo (nunca en texto plano). Toda comunicación viaja por HTTPS. El control de acceso se aplica en el backend según el rol y el tenant del usuario: ningún usuario puede acceder a datos de otra licorera. El </w:t>
-      </w:r>
-      <w:r>
-        <w:lastRenderedPageBreak/>
-        <w:t>tratamiento de datos personales cumple la Ley 1581 de 2012 (aviso de privacidad, finalidad y derechos de los titulares).</w:t>
+        <w:t>Las contraseñas se almacenan cifradas con un algoritmo de hash adaptativo (nunca en texto plano). Toda comunicación viaja por HTTPS. El control de acceso se aplica en el backend según el rol y el tenant del usuario: ningún usuario puede acceder a datos de otra licorera. El tratamiento de datos personales cumple la Ley 1581 de 2012 (aviso de privacidad, finalidad y derechos de los titulares).</w:t>
       </w:r>
     </w:p>
     <w:p>
@@ -22998,7 +23005,7 @@
           </w:tcPr>
           <w:p>
             <w:r>
-              <w:t>«Control por botella y por referencia, alertas de stock bajo y de baja rotación» (propuesta de valor).</w:t>
+              <w:t>«Control por botella y por referencia, alertas de existencias bajas y de baja rotación» (propuesta de valor).</w:t>
             </w:r>
           </w:p>
         </w:tc>

</xml_diff>

<commit_message>
Construyo la prueba gratuita de quince dias sobre el plan pro
</commit_message>
<xml_diff>
--- a/docs/analisis/INVENTRA_ERS_IEEE_830.docx
+++ b/docs/analisis/INVENTRA_ERS_IEEE_830.docx
@@ -20341,7 +20341,7 @@
           </w:tcPr>
           <w:p>
             <w:r>
-              <w:t>El sistema debe permitir crear la cuenta de una licorera nueva con sus datos comerciales, el plan contratado (Básico o Pro) y el usuario administrador inicial, por dos vías: el registro por autoservicio desde la pantalla pública, que inicia un período de prueba gratuito con fecha de vencimiento, y el alta directa por parte del Administrador INVENTRA, con el plan que el negocio haya contratado. En ambos casos la cuenta queda pendiente de verificación hasta que la persona abre el enlace enviado a su correo. Los datos de cada licorera quedan completamente aislados de los de las demás. Mientras el correo no esté verificado, el sistema muestra un aviso permanente y permite pedir un enlace nuevo desde la propia aplicación. El enlace de confirmación vence a los tres días; la cuenta funciona con normalidad entre tanto.</w:t>
+              <w:t>El sistema debe permitir crear la cuenta de una licorera nueva con sus datos comerciales, el plan contratado (Básico o Pro) y el usuario administrador inicial, por dos vías: el registro por autoservicio desde la pantalla pública, que inicia un período de prueba gratuito con fecha de vencimiento, y el alta directa por parte del Administrador INVENTRA, con el plan que el negocio haya contratado. En ambos casos la cuenta queda pendiente de verificación hasta que la persona abre el enlace enviado a su correo. El período de prueba dura quince días y habilita las funciones del plan Pro, de modo que el negocio pueda evaluar el sistema completo; la prueba no se cobra y su precio pactado es cero. Los datos de cada licorera quedan completamente aislados de los de las demás. Mientras el correo no esté verificado, el sistema muestra un aviso permanente y permite pedir un enlace nuevo desde la propia aplicación. El enlace de confirmación vence a los tres días; la cuenta funciona con normalidad entre tanto.</w:t>
             </w:r>
           </w:p>
         </w:tc>
@@ -20629,7 +20629,7 @@
           </w:tcPr>
           <w:p>
             <w:r>
-              <w:t>El sistema debe permitir subir una licorera de Básico a Pro (habilitando multisede, reportes avanzados y facturación electrónica) o bajarla de Pro a Básico validando que no tenga más de una sede activa.</w:t>
+              <w:t>El sistema debe permitir subir una licorera de Básico a Pro, habilitando multisede, reportes avanzados y facturación electrónica, o bajarla de Pro a Básico. El cambio se rechaza mientras la licorera tenga más sedes activas o más usuarios activos de los que admite el plan de destino; en ese caso el sistema indica qué límite se excede y en cuánto, y no inactiva sedes ni usuarios por su cuenta. El precio pactado se congela el día de la contratación, en la suscripción que abre el plan nuevo.</w:t>
             </w:r>
           </w:p>
         </w:tc>
@@ -21145,6 +21145,7 @@
                 <w:b/>
                 <w:bCs/>
               </w:rPr>
+              <w:lastRenderedPageBreak/>
               <w:t>Prioridad</w:t>
             </w:r>
           </w:p>
@@ -21203,11 +21204,7 @@
           </w:tcPr>
           <w:p>
             <w:r>
-              <w:t xml:space="preserve">El sistema debe habilitar o bloquear módulos según el plan: el Básico incluye SEG, INV, VEN y reportes básicos para 1 usuario y 1 sede; el </w:t>
-            </w:r>
-            <w:r>
-              <w:lastRenderedPageBreak/>
-              <w:t>Pro agrega multiusuario, multisede (SED), reportes avanzados (REP) y facturación electrónica (FAC).</w:t>
+              <w:t>El sistema debe habilitar o bloquear módulos según el plan: el Básico incluye SEG, INV, VEN y reportes básicos para 1 usuario y 1 sede; el Pro agrega multiusuario, multisede (SED), reportes avanzados (REP) y facturación electrónica (FAC).</w:t>
             </w:r>
           </w:p>
         </w:tc>
@@ -21864,6 +21861,7 @@
                 <w:b/>
                 <w:bCs/>
               </w:rPr>
+              <w:lastRenderedPageBreak/>
               <w:t>Número de requisito</w:t>
             </w:r>
           </w:p>
@@ -21946,7 +21944,6 @@
                 <w:b/>
                 <w:bCs/>
               </w:rPr>
-              <w:lastRenderedPageBreak/>
               <w:t>Tipo</w:t>
             </w:r>
           </w:p>
@@ -22697,6 +22694,7 @@
         <w:spacing w:after="120" w:line="276" w:lineRule="auto"/>
       </w:pPr>
       <w:r>
+        <w:lastRenderedPageBreak/>
         <w:t>Las operaciones habituales (registrar una venta, consultar el inventario) deben responder en menos de 3 segundos en condiciones normales, con al menos 50 usuarios concurrentes en la plataforma. El registro de una venta en el punto de venta no debe requerir más de 4 interacciones (clics/toques) en el caso típico.</w:t>
       </w:r>
     </w:p>
@@ -22706,7 +22704,6 @@
       </w:pPr>
       <w:bookmarkStart w:id="79" w:name="_Toc235640568"/>
       <w:r>
-        <w:lastRenderedPageBreak/>
         <w:t>RNF-02 — Seguridad</w:t>
       </w:r>
       <w:bookmarkEnd w:id="79"/>
@@ -22834,6 +22831,7 @@
         <w:spacing w:after="120" w:line="276" w:lineRule="auto"/>
       </w:pPr>
       <w:r>
+        <w:lastRenderedPageBreak/>
         <w:t>El sistema debe apoyar el cumplimiento normativo del negocio del licor: facturación electrónica conforme a la normatividad DIAN vigente (plan Pro) y protección de datos personales conforme a la Ley 1581 de 2012, incluido el registro de las bases de datos ante la SIC.</w:t>
       </w:r>
     </w:p>

</xml_diff>

<commit_message>
Defino la vigencia de la suscripcion y quien ejecuta el cambio de plan
</commit_message>
<xml_diff>
--- a/docs/analisis/INVENTRA_ERS_IEEE_830.docx
+++ b/docs/analisis/INVENTRA_ERS_IEEE_830.docx
@@ -20341,7 +20341,7 @@
           </w:tcPr>
           <w:p>
             <w:r>
-              <w:t>El sistema debe permitir crear la cuenta de una licorera nueva con sus datos comerciales, el plan contratado (Básico o Pro) y el usuario administrador inicial, por dos vías: el registro por autoservicio desde la pantalla pública, que inicia un período de prueba gratuito con fecha de vencimiento, y el alta directa por parte del Administrador INVENTRA, con el plan que el negocio haya contratado. En ambos casos la cuenta queda pendiente de verificación hasta que la persona abre el enlace enviado a su correo. El período de prueba dura quince días y habilita las funciones del plan Pro, de modo que el negocio pueda evaluar el sistema completo; la prueba no se cobra y su precio pactado es cero. Los datos de cada licorera quedan completamente aislados de los de las demás. Mientras el correo no esté verificado, el sistema muestra un aviso permanente y permite pedir un enlace nuevo desde la propia aplicación. El enlace de confirmación vence a los tres días; la cuenta funciona con normalidad entre tanto.</w:t>
+              <w:t>El sistema debe permitir crear la cuenta de una licorera nueva con sus datos comerciales, el plan contratado (Básico o Pro) y el usuario administrador inicial, por dos vías: el registro por autoservicio desde la pantalla pública, que inicia un período de prueba gratuito de quince días, y el alta directa por parte del Administrador INVENTRA, con el plan que el negocio haya contratado. En el autoservicio la fecha de fin de la vigencia la fija el sistema; en el alta directa el Administrador INVENTRA define la fecha de fin. En ambos casos la cuenta queda pendiente de verificación hasta que la persona abre el enlace enviado a su correo. Los datos de cada licorera quedan completamente aislados de los de las demás.</w:t>
             </w:r>
           </w:p>
         </w:tc>
@@ -20406,48 +20406,48 @@
                 <w:b/>
                 <w:bCs/>
               </w:rPr>
+              <w:t>Número de requisito</w:t>
+            </w:r>
+          </w:p>
+        </w:tc>
+        <w:tc>
+          <w:tcPr>
+            <w:tcW w:w="7160" w:type="dxa"/>
+            <w:tcMar>
+              <w:top w:w="60" w:type="dxa"/>
+              <w:left w:w="100" w:type="dxa"/>
+              <w:bottom w:w="60" w:type="dxa"/>
+              <w:right w:w="100" w:type="dxa"/>
+            </w:tcMar>
+            <w:vAlign w:val="center"/>
+          </w:tcPr>
+          <w:p>
+            <w:r>
+              <w:t>RF-SUS-02</w:t>
+            </w:r>
+          </w:p>
+        </w:tc>
+      </w:tr>
+      <w:tr>
+        <w:tc>
+          <w:tcPr>
+            <w:tcW w:w="2200" w:type="dxa"/>
+            <w:shd w:val="clear" w:color="auto" w:fill="D9D9D9"/>
+            <w:tcMar>
+              <w:top w:w="60" w:type="dxa"/>
+              <w:left w:w="100" w:type="dxa"/>
+              <w:bottom w:w="60" w:type="dxa"/>
+              <w:right w:w="100" w:type="dxa"/>
+            </w:tcMar>
+            <w:vAlign w:val="center"/>
+          </w:tcPr>
+          <w:p>
+            <w:r>
+              <w:rPr>
+                <w:b/>
+                <w:bCs/>
+              </w:rPr>
               <w:lastRenderedPageBreak/>
-              <w:t>Número de requisito</w:t>
-            </w:r>
-          </w:p>
-        </w:tc>
-        <w:tc>
-          <w:tcPr>
-            <w:tcW w:w="7160" w:type="dxa"/>
-            <w:tcMar>
-              <w:top w:w="60" w:type="dxa"/>
-              <w:left w:w="100" w:type="dxa"/>
-              <w:bottom w:w="60" w:type="dxa"/>
-              <w:right w:w="100" w:type="dxa"/>
-            </w:tcMar>
-            <w:vAlign w:val="center"/>
-          </w:tcPr>
-          <w:p>
-            <w:r>
-              <w:t>RF-SUS-02</w:t>
-            </w:r>
-          </w:p>
-        </w:tc>
-      </w:tr>
-      <w:tr>
-        <w:tc>
-          <w:tcPr>
-            <w:tcW w:w="2200" w:type="dxa"/>
-            <w:shd w:val="clear" w:color="auto" w:fill="D9D9D9"/>
-            <w:tcMar>
-              <w:top w:w="60" w:type="dxa"/>
-              <w:left w:w="100" w:type="dxa"/>
-              <w:bottom w:w="60" w:type="dxa"/>
-              <w:right w:w="100" w:type="dxa"/>
-            </w:tcMar>
-            <w:vAlign w:val="center"/>
-          </w:tcPr>
-          <w:p>
-            <w:r>
-              <w:rPr>
-                <w:b/>
-                <w:bCs/>
-              </w:rPr>
               <w:t>Nombre</w:t>
             </w:r>
           </w:p>
@@ -20629,7 +20629,7 @@
           </w:tcPr>
           <w:p>
             <w:r>
-              <w:t>El sistema debe permitir subir una licorera de Básico a Pro, habilitando multisede, reportes avanzados y facturación electrónica, o bajarla de Pro a Básico. El cambio se rechaza mientras la licorera tenga más sedes activas o más usuarios activos de los que admite el plan de destino; en ese caso el sistema indica qué límite se excede y en cuánto, y no inactiva sedes ni usuarios por su cuenta. El precio pactado se congela el día de la contratación, en la suscripción que abre el plan nuevo.</w:t>
+              <w:t>El sistema debe permitir subir una licorera de Básico a Pro, habilitando multisede, reportes avanzados y facturación electrónica, o bajarla de Pro a Básico. El cambio se rechaza mientras la licorera tenga más sedes activas o más usuarios activos de los que admite el plan de destino; en ese caso el sistema indica qué límite se excede y en cuánto, y no inactiva sedes ni usuarios por su cuenta. La bajada de plan la realiza el Administrador de licorera, que es quien puede decidir qué usuario o sede inactiva, y la suscripción nueva conserva la fecha de fin de la anterior; la subida la realiza el Administrador INVENTRA. El precio pactado se congela el día de la contratación, en la suscripción que abre el plan nuevo.</w:t>
             </w:r>
           </w:p>
         </w:tc>
@@ -20916,7 +20916,7 @@
           </w:tcPr>
           <w:p>
             <w:r>
-              <w:t>El sistema debe manejar los estados de la suscripción: en prueba, activa, en mora, suspendida y cancelada. Una suscripción en prueba da acceso completo hasta su fecha de vencimiento; una activa corresponde al plan contratado y vigente; una cuenta en mora sigue operando y muestra avisos de pago; una suspendida permite consultar la información, pero no registrar operaciones nuevas; y una cancelada corresponde a la baja definitiva del servicio. Al vencer el período de prueba sin contratar un plan, la suscripción pasa a suspendida.</w:t>
+              <w:t>El sistema debe manejar los estados de la suscripción: en prueba, activa, en mora, suspendida y cancelada. Una suscripción en prueba da acceso completo hasta su fecha de vencimiento; una activa corresponde al plan contratado y vigente; una cuenta en mora sigue operando y muestra avisos de pago; una suspendida permite consultar la información, pero no registrar operaciones nuevas; y una cancelada corresponde a la baja definitiva del servicio. Toda suscripción tiene fecha de fin y el estado se deriva de ella: el sistema avisa en el panel durante los tres días anteriores al vencimiento, mantiene la cuenta en mora durante los cuatro días siguientes y la suspende al quinto. Al vencer el período de prueba sin contratar un plan, la suscripción pasa a suspendida sin días de gracia. El Administrador INVENTRA define la fecha de fin al activar y al renovar y puede corregirla, sin fijarla nunca en una fecha pasada, y cada vez que la modifica el sistema informa por correo al Administrador de licorera.</w:t>
             </w:r>
           </w:p>
         </w:tc>
@@ -20981,6 +20981,7 @@
                 <w:b/>
                 <w:bCs/>
               </w:rPr>
+              <w:lastRenderedPageBreak/>
               <w:t>Número de requisito</w:t>
             </w:r>
           </w:p>
@@ -21145,7 +21146,6 @@
                 <w:b/>
                 <w:bCs/>
               </w:rPr>
-              <w:lastRenderedPageBreak/>
               <w:t>Prioridad</w:t>
             </w:r>
           </w:p>
@@ -21779,6 +21779,7 @@
                 <w:b/>
                 <w:bCs/>
               </w:rPr>
+              <w:lastRenderedPageBreak/>
               <w:t>Descripción</w:t>
             </w:r>
           </w:p>
@@ -21861,7 +21862,6 @@
                 <w:b/>
                 <w:bCs/>
               </w:rPr>
-              <w:lastRenderedPageBreak/>
               <w:t>Número de requisito</w:t>
             </w:r>
           </w:p>
@@ -22641,6 +22641,7 @@
                 <w:b/>
                 <w:bCs/>
               </w:rPr>
+              <w:lastRenderedPageBreak/>
               <w:t>Descripción</w:t>
             </w:r>
           </w:p>
@@ -22694,7 +22695,6 @@
         <w:spacing w:after="120" w:line="276" w:lineRule="auto"/>
       </w:pPr>
       <w:r>
-        <w:lastRenderedPageBreak/>
         <w:t>Las operaciones habituales (registrar una venta, consultar el inventario) deben responder en menos de 3 segundos en condiciones normales, con al menos 50 usuarios concurrentes en la plataforma. El registro de una venta en el punto de venta no debe requerir más de 4 interacciones (clics/toques) en el caso típico.</w:t>
       </w:r>
     </w:p>
@@ -22813,6 +22813,7 @@
         <w:spacing w:after="120" w:line="276" w:lineRule="auto"/>
       </w:pPr>
       <w:r>
+        <w:lastRenderedPageBreak/>
         <w:t>El sistema debe poder ser usado por personas sin experiencia técnica después de una capacitación de máximo 3 horas (coherente con el servicio de Implementación y capacitación del modelo de negocio). El vocabulario de la interfaz es el del comercio: «botellas», «surtido», «cierre de caja», evitando términos técnicos. La interfaz debe ofrecer modo claro y modo oscuro con sus respectivas paletas y botones de acción, tomando como valor inicial la preferencia del sistema operativo y conservando la elección del usuario en el dispositivo.</w:t>
       </w:r>
     </w:p>
@@ -22831,7 +22832,6 @@
         <w:spacing w:after="120" w:line="276" w:lineRule="auto"/>
       </w:pPr>
       <w:r>
-        <w:lastRenderedPageBreak/>
         <w:t>El sistema debe apoyar el cumplimiento normativo del negocio del licor: facturación electrónica conforme a la normatividad DIAN vigente (plan Pro) y protección de datos personales conforme a la Ley 1581 de 2012, incluido el registro de las bases de datos ante la SIC.</w:t>
       </w:r>
     </w:p>

</xml_diff>

<commit_message>
Construyo la bajada de plan con sus validaciones
</commit_message>
<xml_diff>
--- a/docs/analisis/INVENTRA_ERS_IEEE_830.docx
+++ b/docs/analisis/INVENTRA_ERS_IEEE_830.docx
@@ -7304,7 +7304,10 @@
         <w:spacing w:after="120" w:line="276" w:lineRule="auto"/>
       </w:pPr>
       <w:r>
-        <w:t>INVENTRA es un producto de software independiente y nuevo (no reemplaza ni amplía un sistema existente del cliente). Se concibe como una aplicación web multiempresa con arquitectura cliente–servidor: un frontend web responsive (usable desde computador, tableta o celular), un backend con API REST que concentra la lógica de negocio y una base de datos relacional. Se integra con dos servicios externos: el proveedor tecnológico de facturación electrónica autorizado por la DIAN (plan Pro) y el servicio de correo para notificaciones.</w:t>
+        <w:t>INVENTRA es un producto de software independiente y nuevo (no reemplaza ni amplía un sistema existente del cliente). Se concibe como una aplicación web multiempresa con arquitectura cliente–servidor: un frontend web responsive (usable desde computador, tableta o celular), un backend con API REST que concentra la lógica de negocio y una base de datos relacional. Se integra con dos servicios externos: el proveedor tecnológico de facturación electrónica autorizado por la DIAN (plan Pro) y el servicio de correo para notificaciones</w:t>
+      </w:r>
+      <w:r>
+        <w:t>.</w:t>
       </w:r>
     </w:p>
     <w:p>
@@ -20629,7 +20632,7 @@
           </w:tcPr>
           <w:p>
             <w:r>
-              <w:t>El sistema debe permitir subir una licorera de Básico a Pro, habilitando multisede, reportes avanzados y facturación electrónica, o bajarla de Pro a Básico. El cambio se rechaza mientras la licorera tenga más sedes activas o más usuarios activos de los que admite el plan de destino; en ese caso el sistema indica qué límite se excede y en cuánto, y no inactiva sedes ni usuarios por su cuenta. La bajada de plan la realiza el Administrador de licorera, que es quien puede decidir qué usuario o sede inactiva, y la suscripción nueva conserva la fecha de fin de la anterior; la subida la realiza el Administrador INVENTRA. El precio pactado se congela el día de la contratación, en la suscripción que abre el plan nuevo.</w:t>
+              <w:t>El sistema debe permitir subir una licorera de Básico a Pro, habilitando multisede, reportes avanzados y facturación electrónica, o bajarla de Pro a Básico. El cambio se rechaza mientras la licorera tenga más sedes activas o más usuarios activos de los que admite el plan de destino; en ese caso el sistema indica qué límite se excede y en cuánto, y no inactiva sedes ni usuarios por su cuenta. La bajada de plan la realiza el Administrador de licorera, que es quien puede decidir qué usuario o sede inactiva, y la suscripción nueva conserva la fecha de fin de la anterior; la subida la realiza el Administrador INVENTRA. Durante el período de prueba no se admite el cambio de plan: la prueba corresponde al plan Pro y es al terminar cuando el negocio elige el plan que contrata. El precio pactado se congela el día de la contratación, en la suscripción que abre el plan nuevo.</w:t>
             </w:r>
           </w:p>
         </w:tc>
@@ -20937,6 +20940,7 @@
           <w:sz w:val="22"/>
           <w:szCs w:val="22"/>
         </w:rPr>
+        <w:lastRenderedPageBreak/>
         <w:t>RF-SUS-04 Restringir funcionalidades según plan</w:t>
       </w:r>
       <w:bookmarkEnd w:id="70"/>
@@ -20981,7 +20985,6 @@
                 <w:b/>
                 <w:bCs/>
               </w:rPr>
-              <w:lastRenderedPageBreak/>
               <w:t>Número de requisito</w:t>
             </w:r>
           </w:p>
@@ -21738,6 +21741,7 @@
                 <w:b/>
                 <w:bCs/>
               </w:rPr>
+              <w:lastRenderedPageBreak/>
               <w:t>Prioridad</w:t>
             </w:r>
           </w:p>
@@ -21779,7 +21783,6 @@
                 <w:b/>
                 <w:bCs/>
               </w:rPr>
-              <w:lastRenderedPageBreak/>
               <w:t>Descripción</w:t>
             </w:r>
           </w:p>

</xml_diff>

<commit_message>
Construyo el panel de la plataforma con el alta de licoreras y la renovacion
</commit_message>
<xml_diff>
--- a/docs/analisis/INVENTRA_ERS_IEEE_830.docx
+++ b/docs/analisis/INVENTRA_ERS_IEEE_830.docx
@@ -11054,7 +11054,10 @@
           </w:tcPr>
           <w:p>
             <w:r>
-              <w:t>El sistema debe permitir registrar cada referencia de producto con: nombre, categoría (aguardiente, ron, cerveza, whisky, vino, otros), presentación (media, botella, litro, garrafa, unidad), código de barras (opcional), precio de venta y mínimo de existencias para la alerta. El costo no se registra en la referencia: entra con cada lote de mercancía, porque la valoración PEPS exige el costo real de cada entrada y no un costo único por producto.</w:t>
+              <w:t>El sistema debe permitir registrar cada referencia de producto con: nombre, categoría (aguardiente, ron, cerveza, whisky, vino, otros), presentación (media, botella, litro, garrafa, unidad), código de barras (opcional), precio de venta y mínimo de existencias para la alerta. El costo no se registra en la referencia: entra con cada lote de mercancía, porque la valoración PEPS exige el costo real de cada entrada y no un costo único por producto</w:t>
+            </w:r>
+            <w:r>
+              <w:t>.</w:t>
             </w:r>
           </w:p>
         </w:tc>
@@ -20344,7 +20347,7 @@
           </w:tcPr>
           <w:p>
             <w:r>
-              <w:t>El sistema debe permitir crear la cuenta de una licorera nueva con sus datos comerciales, el plan contratado (Básico o Pro) y el usuario administrador inicial, por dos vías: el registro por autoservicio desde la pantalla pública, que inicia un período de prueba gratuito de quince días, y el alta directa por parte del Administrador INVENTRA, con el plan que el negocio haya contratado. En el autoservicio la fecha de fin de la vigencia la fija el sistema; en el alta directa el Administrador INVENTRA define la fecha de fin. En ambos casos la cuenta queda pendiente de verificación hasta que la persona abre el enlace enviado a su correo. Los datos de cada licorera quedan completamente aislados de los de las demás.</w:t>
+              <w:t>El sistema debe permitir crear la cuenta de una licorera nueva con sus datos comerciales, el plan contratado (Básico o Pro) y el usuario administrador inicial, por dos vías: el registro por autoservicio desde la pantalla pública, que inicia un período de prueba gratuito de quince días, y el alta directa por parte del Administrador INVENTRA, con el plan que el negocio haya contratado. En el autoservicio la fecha de fin de la vigencia la fija el sistema; en el alta directa el Administrador INVENTRA define la fecha de fin, y la cuenta del administrador del negocio se crea sin una contraseña utilizable: su dueño la define abriendo el enlace que el sistema le envía, de modo que nadie más la conoce. En ambos casos la cuenta queda pendiente de verificación hasta que la persona abre el enlace enviado a su correo. Los datos de cada licorera quedan completamente aislados de los de las demás.</w:t>
             </w:r>
           </w:p>
         </w:tc>
@@ -20409,6 +20412,7 @@
                 <w:b/>
                 <w:bCs/>
               </w:rPr>
+              <w:lastRenderedPageBreak/>
               <w:t>Número de requisito</w:t>
             </w:r>
           </w:p>
@@ -20450,7 +20454,6 @@
                 <w:b/>
                 <w:bCs/>
               </w:rPr>
-              <w:lastRenderedPageBreak/>
               <w:t>Nombre</w:t>
             </w:r>
           </w:p>
@@ -20632,7 +20635,7 @@
           </w:tcPr>
           <w:p>
             <w:r>
-              <w:t>El sistema debe permitir subir una licorera de Básico a Pro, habilitando multisede, reportes avanzados y facturación electrónica, o bajarla de Pro a Básico. El cambio se rechaza mientras la licorera tenga más sedes activas o más usuarios activos de los que admite el plan de destino; en ese caso el sistema indica qué límite se excede y en cuánto, y no inactiva sedes ni usuarios por su cuenta. La bajada de plan la realiza el Administrador de licorera, que es quien puede decidir qué usuario o sede inactiva, y la suscripción nueva conserva la fecha de fin de la anterior; la subida la realiza el Administrador INVENTRA. Durante el período de prueba no se admite el cambio de plan: la prueba corresponde al plan Pro y es al terminar cuando el negocio elige el plan que contrata. El precio pactado se congela el día de la contratación, en la suscripción que abre el plan nuevo.</w:t>
+              <w:t>El sistema debe permitir subir una licorera de Básico a Pro, habilitando multisede, reportes avanzados y facturación electrónica, o bajarla de Pro a Básico. El cambio se rechaza mientras la licorera tenga más sedes activas o más usuarios activos de los que admite el plan de destino; en ese caso el sistema indica qué límite se excede y en cuánto, y no inactiva sedes ni usuarios por su cuenta. La bajada de plan la realiza el Administrador de licorera, que es quien puede decidir qué usuario o sede inactiva, y la suscripción nueva conserva la fecha de fin de la anterior; la subida la realiza el Administrador INVENTRA, y en ella la fecha de fin de la suscripción nueva la define el Administrador INVENTRA, igual que al activar y al renovar. Durante el período de prueba no se admite el cambio de plan: la prueba corresponde al plan Pro y es al terminar cuando el negocio elige el plan que contrata. El precio pactado se congela el día de la contratación, en la suscripción que abre el plan nuevo.</w:t>
             </w:r>
           </w:p>
         </w:tc>
@@ -20919,7 +20922,11 @@
           </w:tcPr>
           <w:p>
             <w:r>
-              <w:t>El sistema debe manejar los estados de la suscripción: en prueba, activa, en mora, suspendida y cancelada. Una suscripción en prueba da acceso completo hasta su fecha de vencimiento; una activa corresponde al plan contratado y vigente; una cuenta en mora sigue operando y muestra avisos de pago; una suspendida permite consultar la información, pero no registrar operaciones nuevas; y una cancelada corresponde a la baja definitiva del servicio. Toda suscripción tiene fecha de fin y el estado se deriva de ella: el sistema avisa en el panel durante los tres días anteriores al vencimiento, mantiene la cuenta en mora durante los cuatro días siguientes y la suspende al quinto. Al vencer el período de prueba sin contratar un plan, la suscripción pasa a suspendida sin días de gracia. El Administrador INVENTRA define la fecha de fin al activar y al renovar y puede corregirla, sin fijarla nunca en una fecha pasada, y cada vez que la modifica el sistema informa por correo al Administrador de licorera.</w:t>
+              <w:t xml:space="preserve">El sistema debe manejar los estados de la suscripción: en prueba, activa, en mora, suspendida y cancelada. Una suscripción en prueba da acceso completo hasta su fecha de vencimiento; una activa corresponde al plan contratado y vigente; una cuenta en mora sigue operando y muestra avisos de pago; una suspendida permite consultar la información, pero no registrar operaciones nuevas; y una cancelada corresponde a la baja definitiva del servicio. Toda suscripción tiene fecha de fin y el estado se deriva de ella: el sistema avisa en el panel durante los tres días anteriores al vencimiento, mantiene la cuenta en mora durante los cuatro días siguientes y la suspende al quinto. Al vencer el período de prueba sin contratar un plan, la suscripción pasa a suspendida sin días de gracia. El Administrador INVENTRA define la </w:t>
+            </w:r>
+            <w:r>
+              <w:lastRenderedPageBreak/>
+              <w:t>fecha de fin al activar y al renovar y puede corregirla, sin fijarla nunca en una fecha pasada, y cada vez que la modifica el sistema informa por correo al Administrador de licorera.</w:t>
             </w:r>
           </w:p>
         </w:tc>
@@ -20940,7 +20947,6 @@
           <w:sz w:val="22"/>
           <w:szCs w:val="22"/>
         </w:rPr>
-        <w:lastRenderedPageBreak/>
         <w:t>RF-SUS-04 Restringir funcionalidades según plan</w:t>
       </w:r>
       <w:bookmarkEnd w:id="70"/>
@@ -21659,6 +21665,7 @@
                 <w:b/>
                 <w:bCs/>
               </w:rPr>
+              <w:lastRenderedPageBreak/>
               <w:t>Tipo</w:t>
             </w:r>
           </w:p>
@@ -21741,7 +21748,6 @@
                 <w:b/>
                 <w:bCs/>
               </w:rPr>
-              <w:lastRenderedPageBreak/>
               <w:t>Prioridad</w:t>
             </w:r>
           </w:p>
@@ -22562,6 +22568,7 @@
                 <w:b/>
                 <w:bCs/>
               </w:rPr>
+              <w:lastRenderedPageBreak/>
               <w:t>Fuente del requisito</w:t>
             </w:r>
           </w:p>
@@ -22644,7 +22651,6 @@
                 <w:b/>
                 <w:bCs/>
               </w:rPr>
-              <w:lastRenderedPageBreak/>
               <w:t>Descripción</w:t>
             </w:r>
           </w:p>
@@ -22797,6 +22803,7 @@
       </w:pPr>
       <w:bookmarkStart w:id="84" w:name="_Toc235640573"/>
       <w:r>
+        <w:lastRenderedPageBreak/>
         <w:t>3.4 Otros requisitos</w:t>
       </w:r>
       <w:bookmarkEnd w:id="84"/>
@@ -22816,7 +22823,6 @@
         <w:spacing w:after="120" w:line="276" w:lineRule="auto"/>
       </w:pPr>
       <w:r>
-        <w:lastRenderedPageBreak/>
         <w:t>El sistema debe poder ser usado por personas sin experiencia técnica después de una capacitación de máximo 3 horas (coherente con el servicio de Implementación y capacitación del modelo de negocio). El vocabulario de la interfaz es el del comercio: «botellas», «surtido», «cierre de caja», evitando términos técnicos. La interfaz debe ofrecer modo claro y modo oscuro con sus respectivas paletas y botones de acción, tomando como valor inicial la preferencia del sistema operativo y conservando la elección del usuario en el dispositivo.</w:t>
       </w:r>
     </w:p>

</xml_diff>

<commit_message>
Exijo el correo confirmado antes de registrar informacion
El registro por autoservicio entregaba quince dias del plan Pro a cualquier direccion escrita, y lo registrado quedaba a nombre de un correo que nadie demostro controlar. Desde ahora toda cuenta con el correo sin confirmar consulta pero no registra, con el mismo permiso que ya vigilaba la suscripcion. Abro la correccion del propio correo mientras la cuenta siga pendiente, cierro el cambio silencioso de una direccion ya confirmada, y acepto el enlace de restablecer contrasena como prueba equivalente. Trece pruebas nuevas: 216 en total.
</commit_message>
<xml_diff>
--- a/docs/analisis/INVENTRA_ERS_IEEE_830.docx
+++ b/docs/analisis/INVENTRA_ERS_IEEE_830.docx
@@ -7791,7 +7791,10 @@
         <w:spacing w:after="80"/>
       </w:pPr>
       <w:r>
-        <w:t>Los datos de cada licorera deben permanecer aislados de los de las demás (arquitectura multiempresa).</w:t>
+        <w:t>Los datos de cada licorera deben permanecer aislados de los de las demás (arquitectura multiempresa)</w:t>
+      </w:r>
+      <w:r>
+        <w:t>.</w:t>
       </w:r>
     </w:p>
     <w:p>
@@ -10461,7 +10464,7 @@
           </w:tcPr>
           <w:p>
             <w:r>
-              <w:t>El sistema debe permitir al usuario actualizar sus datos personales (nombre, teléfono, contraseña). El correo electrónico solo puede cambiarlo el Administrador de licorera, por ser el identificador de acceso.</w:t>
+              <w:t>El sistema debe permitir al usuario actualizar sus datos personales (nombre, teléfono, contraseña). El correo electrónico solo puede cambiarlo el Administrador de licorera, por ser el identificador de acceso, con una excepción: el propio titular puede corregirlo mientras su cuenta siga pendiente de confirmación, porque quien se registra por autoservicio es el único administrador de su licorera y no hay nadie por encima que se lo corrija. Cambiar el correo, lo haga quien lo haga, deja la cuenta pendiente de confirmación otra vez y el sistema envía el enlace a la dirección nueva; el enlace anterior deja de ser válido.</w:t>
             </w:r>
           </w:p>
         </w:tc>
@@ -10774,6 +10777,7 @@
         <w:spacing w:after="120" w:line="276" w:lineRule="auto"/>
       </w:pPr>
       <w:r>
+        <w:lastRenderedPageBreak/>
         <w:t>Es el corazón del producto: administra el catálogo de referencias de licor y el control de existencias por botella. Incluye las entradas de mercancía, los ajustes y las dos alertas prometidas en la propuesta de valor: existencias bajas y baja rotación. El inventario se valora por lotes con el método PEPS (primeras entradas, primeras salidas), manteniendo el costo de adquisición completamente separado del precio de venta, como lo hacen los sistemas de referencia del mercado (SAP Business One, Dynamics 365 Business Central, Odoo, Siigo).</w:t>
       </w:r>
     </w:p>
@@ -10787,7 +10791,6 @@
           <w:sz w:val="22"/>
           <w:szCs w:val="22"/>
         </w:rPr>
-        <w:lastRenderedPageBreak/>
         <w:t>RF-INV-01 Registrar producto</w:t>
       </w:r>
       <w:bookmarkEnd w:id="30"/>
@@ -11491,6 +11494,7 @@
                 <w:b/>
                 <w:bCs/>
               </w:rPr>
+              <w:lastRenderedPageBreak/>
               <w:t>Tipo</w:t>
             </w:r>
           </w:p>
@@ -11631,11 +11635,7 @@
           </w:tcPr>
           <w:p>
             <w:r>
-              <w:t xml:space="preserve">El sistema debe permitir modificar los datos de una referencia (precios, mínimo de existencias, categoría). Los cambios de precio no alteran </w:t>
-            </w:r>
-            <w:r>
-              <w:lastRenderedPageBreak/>
-              <w:t>las ventas históricas, que conservan el precio vigente al momento de la venta.</w:t>
+              <w:t>El sistema debe permitir modificar los datos de una referencia (precios, mínimo de existencias, categoría). Los cambios de precio no alteran las ventas históricas, que conservan el precio vigente al momento de la venta.</w:t>
             </w:r>
           </w:p>
         </w:tc>
@@ -12274,6 +12274,7 @@
                 <w:b/>
                 <w:bCs/>
               </w:rPr>
+              <w:lastRenderedPageBreak/>
               <w:t>Número de requisito</w:t>
             </w:r>
           </w:p>
@@ -12479,7 +12480,6 @@
                 <w:b/>
                 <w:bCs/>
               </w:rPr>
-              <w:lastRenderedPageBreak/>
               <w:t>Descripción</w:t>
             </w:r>
           </w:p>
@@ -13136,6 +13136,7 @@
                 <w:b/>
                 <w:bCs/>
               </w:rPr>
+              <w:lastRenderedPageBreak/>
               <w:t>Número de requisito</w:t>
             </w:r>
           </w:p>
@@ -13341,7 +13342,6 @@
                 <w:b/>
                 <w:bCs/>
               </w:rPr>
-              <w:lastRenderedPageBreak/>
               <w:t>Descripción</w:t>
             </w:r>
           </w:p>
@@ -14016,7 +14016,6 @@
                 <w:b/>
                 <w:bCs/>
               </w:rPr>
-              <w:lastRenderedPageBreak/>
               <w:t>Número de requisito</w:t>
             </w:r>
           </w:p>
@@ -14714,6 +14713,7 @@
                 <w:b/>
                 <w:bCs/>
               </w:rPr>
+              <w:lastRenderedPageBreak/>
               <w:t>Fuente del requisito</w:t>
             </w:r>
           </w:p>
@@ -15575,6 +15575,7 @@
                 <w:b/>
                 <w:bCs/>
               </w:rPr>
+              <w:lastRenderedPageBreak/>
               <w:t>Fuente del requisito</w:t>
             </w:r>
           </w:p>
@@ -15674,11 +15675,7 @@
           </w:tcPr>
           <w:p>
             <w:r>
-              <w:t xml:space="preserve">El sistema debe generar el cierre del día: total vendido por medio de pago, número de transacciones, y comparación con el efectivo contado por el usuario, dejando registro de las diferencias. El cierre es diario y por sede, no por turno ni por vendedor: el dinero pertenece a la sede, </w:t>
-            </w:r>
-            <w:r>
-              <w:lastRenderedPageBreak/>
-              <w:t>de modo que varios vendedores registran ventas contra el mismo cierre y este se realiza una vez al día.</w:t>
+              <w:t>El sistema debe generar el cierre del día: total vendido por medio de pago, número de transacciones, y comparación con el efectivo contado por el usuario, dejando registro de las diferencias. El cierre es diario y por sede, no por turno ni por vendedor: el dinero pertenece a la sede, de modo que varios vendedores registran ventas contra el mismo cierre y este se realiza una vez al día.</w:t>
             </w:r>
           </w:p>
         </w:tc>
@@ -16335,6 +16332,7 @@
                 <w:b/>
                 <w:bCs/>
               </w:rPr>
+              <w:lastRenderedPageBreak/>
               <w:t>Número de requisito</w:t>
             </w:r>
           </w:p>
@@ -16499,7 +16497,6 @@
                 <w:b/>
                 <w:bCs/>
               </w:rPr>
-              <w:lastRenderedPageBreak/>
               <w:t>Prioridad</w:t>
             </w:r>
           </w:p>
@@ -17158,6 +17155,7 @@
         <w:spacing w:after="120" w:line="276" w:lineRule="auto"/>
       </w:pPr>
       <w:r>
+        <w:lastRenderedPageBreak/>
         <w:t>Convierte los datos en decisiones. Los reportes básicos pertenecen al plan Básico; los avanzados (franja horaria, rotación y utilidad) son diferenciadores del plan Pro y de la propuesta de valor frente a la competencia genérica.</w:t>
       </w:r>
     </w:p>
@@ -17297,7 +17295,6 @@
                 <w:b/>
                 <w:bCs/>
               </w:rPr>
-              <w:lastRenderedPageBreak/>
               <w:t>Tipo</w:t>
             </w:r>
           </w:p>
@@ -18012,7 +18009,11 @@
           </w:tcPr>
           <w:p>
             <w:r>
-              <w:t>El sistema debe mostrar las referencias más vendidas segmentadas por franja horaria (mañana, tarde, noche, madrugada), para que el tendero planifique surtido y personal según el comportamiento real de su negocio.</w:t>
+              <w:t xml:space="preserve">El sistema debe mostrar las referencias más vendidas segmentadas por franja horaria (mañana, tarde, noche, madrugada), para que el </w:t>
+            </w:r>
+            <w:r>
+              <w:lastRenderedPageBreak/>
+              <w:t>tendero planifique surtido y personal según el comportamiento real de su negocio.</w:t>
             </w:r>
           </w:p>
         </w:tc>
@@ -18159,7 +18160,6 @@
                 <w:b/>
                 <w:bCs/>
               </w:rPr>
-              <w:lastRenderedPageBreak/>
               <w:t>Tipo</w:t>
             </w:r>
           </w:p>
@@ -18857,6 +18857,7 @@
                 <w:b/>
                 <w:bCs/>
               </w:rPr>
+              <w:lastRenderedPageBreak/>
               <w:t>Descripción</w:t>
             </w:r>
           </w:p>
@@ -18913,7 +18914,6 @@
           <w:sz w:val="22"/>
           <w:szCs w:val="22"/>
         </w:rPr>
-        <w:lastRenderedPageBreak/>
         <w:t>RF-FAC-01 Configurar datos de facturación</w:t>
       </w:r>
       <w:bookmarkEnd w:id="62"/>
@@ -19614,6 +19614,7 @@
                 <w:b/>
                 <w:bCs/>
               </w:rPr>
+              <w:lastRenderedPageBreak/>
               <w:t>Tipo</w:t>
             </w:r>
           </w:p>
@@ -19819,7 +19820,6 @@
                 <w:b/>
                 <w:bCs/>
               </w:rPr>
-              <w:lastRenderedPageBreak/>
               <w:t>Número de requisito</w:t>
             </w:r>
           </w:p>
@@ -20347,7 +20347,11 @@
           </w:tcPr>
           <w:p>
             <w:r>
-              <w:t>El sistema debe permitir crear la cuenta de una licorera nueva con sus datos comerciales, el plan contratado (Básico o Pro) y el usuario administrador inicial, por dos vías: el registro por autoservicio desde la pantalla pública, que inicia un período de prueba gratuito de quince días, y el alta directa por parte del Administrador INVENTRA, con el plan que el negocio haya contratado. En el autoservicio la fecha de fin de la vigencia la fija el sistema; en el alta directa el Administrador INVENTRA define la fecha de fin, y la cuenta del administrador del negocio se crea sin una contraseña utilizable: su dueño la define abriendo el enlace que el sistema le envía, de modo que nadie más la conoce. En ambos casos la cuenta queda pendiente de verificación hasta que la persona abre el enlace enviado a su correo. Los datos de cada licorera quedan completamente aislados de los de las demás.</w:t>
+              <w:t xml:space="preserve">El sistema debe permitir crear la cuenta de una licorera nueva con sus datos comerciales, el plan contratado (Básico o Pro) y el usuario administrador inicial, por dos vías: el registro por autoservicio desde la pantalla pública, que inicia un período de prueba gratuito de quince días, y el alta directa por parte del Administrador INVENTRA, con el plan que el negocio haya contratado. En el autoservicio la fecha de fin </w:t>
+            </w:r>
+            <w:r>
+              <w:lastRenderedPageBreak/>
+              <w:t>de la vigencia la fija el sistema; en el alta directa el Administrador INVENTRA define la fecha de fin, y la cuenta del administrador del negocio se crea sin una contraseña utilizable: su dueño la define abriendo el enlace que el sistema le envía, de modo que nadie más la conoce. En ambos casos la cuenta queda pendiente de verificación hasta que la persona abre el enlace enviado a su correo. Mientras siga pendiente, quien entra puede consultar la información, pero el sistema no admite que registre información nueva: la prueba gratuita entrega el plan completo, y entregarlo a una dirección que nadie ha comprobado equivale a entregarlo a un desconocido. Definir la contraseña desde el enlace que el sistema envía al correo confirma también la dirección, porque demuestra lo mismo. Los datos de cada licorera quedan completamente aislados de los de las demás.</w:t>
             </w:r>
           </w:p>
         </w:tc>
@@ -20412,7 +20416,6 @@
                 <w:b/>
                 <w:bCs/>
               </w:rPr>
-              <w:lastRenderedPageBreak/>
               <w:t>Número de requisito</w:t>
             </w:r>
           </w:p>
@@ -20823,6 +20826,7 @@
                 <w:b/>
                 <w:bCs/>
               </w:rPr>
+              <w:lastRenderedPageBreak/>
               <w:t>Fuente del requisito</w:t>
             </w:r>
           </w:p>
@@ -20922,11 +20926,7 @@
           </w:tcPr>
           <w:p>
             <w:r>
-              <w:t xml:space="preserve">El sistema debe manejar los estados de la suscripción: en prueba, activa, en mora, suspendida y cancelada. Una suscripción en prueba da acceso completo hasta su fecha de vencimiento; una activa corresponde al plan contratado y vigente; una cuenta en mora sigue operando y muestra avisos de pago; una suspendida permite consultar la información, pero no registrar operaciones nuevas; y una cancelada corresponde a la baja definitiva del servicio. Toda suscripción tiene fecha de fin y el estado se deriva de ella: el sistema avisa en el panel durante los tres días anteriores al vencimiento, mantiene la cuenta en mora durante los cuatro días siguientes y la suspende al quinto. Al vencer el período de prueba sin contratar un plan, la suscripción pasa a suspendida sin días de gracia. El Administrador INVENTRA define la </w:t>
-            </w:r>
-            <w:r>
-              <w:lastRenderedPageBreak/>
-              <w:t>fecha de fin al activar y al renovar y puede corregirla, sin fijarla nunca en una fecha pasada, y cada vez que la modifica el sistema informa por correo al Administrador de licorera.</w:t>
+              <w:t>El sistema debe manejar los estados de la suscripción: en prueba, activa, en mora, suspendida y cancelada. Una suscripción en prueba da acceso completo hasta su fecha de vencimiento; una activa corresponde al plan contratado y vigente; una cuenta en mora sigue operando y muestra avisos de pago; una suspendida permite consultar la información, pero no registrar operaciones nuevas; y una cancelada corresponde a la baja definitiva del servicio. Toda suscripción tiene fecha de fin y el estado se deriva de ella: el sistema avisa en el panel durante los tres días anteriores al vencimiento, mantiene la cuenta en mora durante los cuatro días siguientes y la suspende al quinto. Al vencer el período de prueba sin contratar un plan, la suscripción pasa a suspendida sin días de gracia. El Administrador INVENTRA define la fecha de fin al activar y al renovar y puede corregirla, sin fijarla nunca en una fecha pasada, y cada vez que la modifica el sistema informa por correo al Administrador de licorera.</w:t>
             </w:r>
           </w:p>
         </w:tc>
@@ -21483,6 +21483,7 @@
                 <w:b/>
                 <w:bCs/>
               </w:rPr>
+              <w:lastRenderedPageBreak/>
               <w:t>Descripción</w:t>
             </w:r>
           </w:p>
@@ -21665,7 +21666,6 @@
                 <w:b/>
                 <w:bCs/>
               </w:rPr>
-              <w:lastRenderedPageBreak/>
               <w:t>Tipo</w:t>
             </w:r>
           </w:p>
@@ -22240,6 +22240,7 @@
                 <w:b/>
                 <w:bCs/>
               </w:rPr>
+              <w:lastRenderedPageBreak/>
               <w:t>Tipo</w:t>
             </w:r>
           </w:p>
@@ -22568,7 +22569,6 @@
                 <w:b/>
                 <w:bCs/>
               </w:rPr>
-              <w:lastRenderedPageBreak/>
               <w:t>Fuente del requisito</w:t>
             </w:r>
           </w:p>
@@ -22758,6 +22758,7 @@
         <w:spacing w:after="120" w:line="276" w:lineRule="auto"/>
       </w:pPr>
       <w:r>
+        <w:lastRenderedPageBreak/>
         <w:t>El servicio debe estar disponible al menos el 99% del tiempo mensual, considerando que las licoreras operan principalmente en horario nocturno y fines de semana; las ventanas de mantenimiento se programarán en horarios de baja actividad (madrugada de días hábiles).</w:t>
       </w:r>
     </w:p>
@@ -22803,7 +22804,6 @@
       </w:pPr>
       <w:bookmarkStart w:id="84" w:name="_Toc235640573"/>
       <w:r>
-        <w:lastRenderedPageBreak/>
         <w:t>3.4 Otros requisitos</w:t>
       </w:r>
       <w:bookmarkEnd w:id="84"/>

</xml_diff>